<commit_message>
Modulo de Curso de capacitacion
</commit_message>
<xml_diff>
--- a/public/templates/acta_entrega_indumentaria.docx
+++ b/public/templates/acta_entrega_indumentaria.docx
@@ -81,6 +81,7 @@
         <w:t>[</w:t>
       </w:r>
       <w:proofErr w:type="spellStart"/>
+      <w:proofErr w:type="gramStart"/>
       <w:r>
         <w:rPr>
           <w:rFonts w:ascii="Arial" w:eastAsia="Arial" w:hAnsi="Arial" w:cs="Arial"/>
@@ -106,6 +107,7 @@
         <w:t>n.nombre</w:t>
       </w:r>
       <w:proofErr w:type="spellEnd"/>
+      <w:proofErr w:type="gramEnd"/>
       <w:r>
         <w:rPr>
           <w:rFonts w:ascii="Arial" w:eastAsia="Arial" w:hAnsi="Arial" w:cs="Arial"/>
@@ -402,7 +404,7 @@
             </w:tr>
             <w:tr>
               <w:trPr>
-                <w:trHeight w:val="360"/>
+                <w:trHeight w:val="315"/>
               </w:trPr>
               <w:tc>
                 <w:tcPr>
@@ -410,32 +412,25 @@
                 </w:tcPr>
                 <w:p>
                   <w:pPr>
-                    <w:rPr>
-                      <w:rFonts w:ascii="Arial" w:eastAsia="Century" w:hAnsi="Arial" w:cs="Arial"/>
-                      <w:color w:val="000000"/>
-                      <w:sz w:val="20"/>
-                    </w:rPr>
-                  </w:pPr>
-                  <w:r>
-                    <w:rPr>
-                      <w:rFonts w:ascii="Arial" w:hAnsi="Arial" w:cs="Arial"/>
-                      <w:sz w:val="20"/>
-                    </w:rPr>
-                    <w:t>[</w:t>
-                  </w:r>
-                  <w:r>
-                    <w:rPr>
-                      <w:rFonts w:ascii="Arial" w:hAnsi="Arial" w:cs="Arial"/>
-                      <w:sz w:val="20"/>
-                    </w:rPr>
-                    <w:t>detalle.articulo</w:t>
-                  </w:r>
-                  <w:r>
-                    <w:rPr>
-                      <w:rFonts w:ascii="Arial" w:hAnsi="Arial" w:cs="Arial"/>
-                      <w:sz w:val="20"/>
-                    </w:rPr>
-                    <w:t xml:space="preserve">_0] </w:t>
+                    <w:tabs>
+                      <w:tab w:val="left" w:pos="1440"/>
+                    </w:tabs>
+                    <w:jc w:val="center"/>
+                    <w:rPr>
+                      <w:rFonts w:ascii="Arial" w:eastAsia="Arial" w:hAnsi="Arial" w:cs="Arial"/>
+                      <w:bCs/>
+                      <w:sz w:val="18"/>
+                      <w:szCs w:val="18"/>
+                    </w:rPr>
+                  </w:pPr>
+                  <w:r>
+                    <w:rPr>
+                      <w:rFonts w:ascii="Arial" w:eastAsia="Arial" w:hAnsi="Arial" w:cs="Arial"/>
+                      <w:bCs/>
+                      <w:sz w:val="18"/>
+                      <w:szCs w:val="18"/>
+                    </w:rPr>
+                    <w:t>BOTAS DIELECTRICAS</w:t>
                   </w:r>
                 </w:p>
               </w:tc>
@@ -445,32 +440,25 @@
                 </w:tcPr>
                 <w:p>
                   <w:pPr>
+                    <w:tabs>
+                      <w:tab w:val="left" w:pos="1440"/>
+                    </w:tabs>
                     <w:jc w:val="center"/>
                     <w:rPr>
-                      <w:rFonts w:ascii="Arial" w:hAnsi="Arial" w:cs="Arial"/>
-                      <w:sz w:val="20"/>
-                    </w:rPr>
-                  </w:pPr>
-                  <w:r>
-                    <w:rPr>
-                      <w:rFonts w:ascii="Arial" w:hAnsi="Arial" w:cs="Arial"/>
-                      <w:sz w:val="20"/>
-                    </w:rPr>
-                    <w:t>[</w:t>
-                  </w:r>
-                  <w:r>
-                    <w:rPr>
-                      <w:rFonts w:ascii="Arial" w:hAnsi="Arial" w:cs="Arial"/>
-                      <w:sz w:val="20"/>
-                    </w:rPr>
-                    <w:t>detalle.cantidad</w:t>
-                  </w:r>
-                  <w:r>
-                    <w:rPr>
-                      <w:rFonts w:ascii="Arial" w:hAnsi="Arial" w:cs="Arial"/>
-                      <w:sz w:val="20"/>
-                    </w:rPr>
-                    <w:t xml:space="preserve">_0] </w:t>
+                      <w:rFonts w:ascii="Arial" w:eastAsia="Arial" w:hAnsi="Arial" w:cs="Arial"/>
+                      <w:bCs/>
+                      <w:sz w:val="18"/>
+                      <w:szCs w:val="18"/>
+                    </w:rPr>
+                  </w:pPr>
+                  <w:r>
+                    <w:rPr>
+                      <w:rFonts w:ascii="Arial" w:eastAsia="Arial" w:hAnsi="Arial" w:cs="Arial"/>
+                      <w:bCs/>
+                      <w:sz w:val="18"/>
+                      <w:szCs w:val="18"/>
+                    </w:rPr>
+                    <w:t>1</w:t>
                   </w:r>
                 </w:p>
               </w:tc>
@@ -480,18 +468,292 @@
                 </w:tcPr>
                 <w:p>
                   <w:pPr>
+                    <w:tabs>
+                      <w:tab w:val="left" w:pos="1440"/>
+                    </w:tabs>
                     <w:jc w:val="center"/>
                     <w:rPr>
-                      <w:rFonts w:ascii="Arial" w:hAnsi="Arial" w:cs="Arial"/>
-                      <w:sz w:val="20"/>
-                    </w:rPr>
-                  </w:pPr>
-                  <w:r>
-                    <w:rPr>
-                      <w:rFonts w:ascii="Arial" w:hAnsi="Arial" w:cs="Arial"/>
-                      <w:sz w:val="20"/>
-                    </w:rPr>
-                    <w:t>[detalle.talla_0]</w:t>
+                      <w:rFonts w:ascii="Arial" w:eastAsia="Arial" w:hAnsi="Arial" w:cs="Arial"/>
+                      <w:bCs/>
+                      <w:sz w:val="18"/>
+                      <w:szCs w:val="18"/>
+                    </w:rPr>
+                  </w:pPr>
+                  <w:r>
+                    <w:rPr>
+                      <w:rFonts w:ascii="Arial" w:eastAsia="Arial" w:hAnsi="Arial" w:cs="Arial"/>
+                      <w:bCs/>
+                      <w:sz w:val="18"/>
+                      <w:szCs w:val="18"/>
+                    </w:rPr>
+                    <w:t>-</w:t>
+                  </w:r>
+                </w:p>
+              </w:tc>
+            </w:tr>
+            <w:tr>
+              <w:trPr>
+                <w:trHeight w:val="315"/>
+              </w:trPr>
+              <w:tc>
+                <w:tcPr>
+                  <w:tcW w:w="2689" w:type="dxa"/>
+                </w:tcPr>
+                <w:p>
+                  <w:pPr>
+                    <w:tabs>
+                      <w:tab w:val="left" w:pos="1440"/>
+                    </w:tabs>
+                    <w:jc w:val="center"/>
+                    <w:rPr>
+                      <w:rFonts w:ascii="Arial" w:eastAsia="Arial" w:hAnsi="Arial" w:cs="Arial"/>
+                      <w:bCs/>
+                      <w:sz w:val="18"/>
+                      <w:szCs w:val="18"/>
+                    </w:rPr>
+                  </w:pPr>
+                  <w:r>
+                    <w:rPr>
+                      <w:rFonts w:ascii="Arial" w:eastAsia="Arial" w:hAnsi="Arial" w:cs="Arial"/>
+                      <w:bCs/>
+                      <w:sz w:val="18"/>
+                      <w:szCs w:val="18"/>
+                    </w:rPr>
+                    <w:t>CASCO DE SEGURIDAD</w:t>
+                  </w:r>
+                </w:p>
+              </w:tc>
+              <w:tc>
+                <w:tcPr>
+                  <w:tcW w:w="1984" w:type="dxa"/>
+                </w:tcPr>
+                <w:p>
+                  <w:pPr>
+                    <w:tabs>
+                      <w:tab w:val="left" w:pos="1440"/>
+                    </w:tabs>
+                    <w:jc w:val="center"/>
+                    <w:rPr>
+                      <w:rFonts w:ascii="Arial" w:eastAsia="Arial" w:hAnsi="Arial" w:cs="Arial"/>
+                      <w:bCs/>
+                      <w:sz w:val="18"/>
+                      <w:szCs w:val="18"/>
+                    </w:rPr>
+                  </w:pPr>
+                  <w:r>
+                    <w:rPr>
+                      <w:rFonts w:ascii="Arial" w:eastAsia="Arial" w:hAnsi="Arial" w:cs="Arial"/>
+                      <w:bCs/>
+                      <w:sz w:val="18"/>
+                      <w:szCs w:val="18"/>
+                    </w:rPr>
+                    <w:t>1</w:t>
+                  </w:r>
+                </w:p>
+              </w:tc>
+              <w:tc>
+                <w:tcPr>
+                  <w:tcW w:w="1985" w:type="dxa"/>
+                </w:tcPr>
+                <w:p>
+                  <w:pPr>
+                    <w:tabs>
+                      <w:tab w:val="left" w:pos="1440"/>
+                    </w:tabs>
+                    <w:jc w:val="center"/>
+                    <w:rPr>
+                      <w:rFonts w:ascii="Arial" w:eastAsia="Arial" w:hAnsi="Arial" w:cs="Arial"/>
+                      <w:bCs/>
+                      <w:sz w:val="18"/>
+                      <w:szCs w:val="18"/>
+                    </w:rPr>
+                  </w:pPr>
+                  <w:r>
+                    <w:rPr>
+                      <w:rFonts w:ascii="Arial" w:eastAsia="Arial" w:hAnsi="Arial" w:cs="Arial"/>
+                      <w:bCs/>
+                      <w:sz w:val="18"/>
+                      <w:szCs w:val="18"/>
+                    </w:rPr>
+                    <w:t>-</w:t>
+                  </w:r>
+                </w:p>
+              </w:tc>
+            </w:tr>
+            <w:tr>
+              <w:trPr>
+                <w:trHeight w:val="315"/>
+              </w:trPr>
+              <w:tc>
+                <w:tcPr>
+                  <w:tcW w:w="2689" w:type="dxa"/>
+                </w:tcPr>
+                <w:p>
+                  <w:pPr>
+                    <w:tabs>
+                      <w:tab w:val="left" w:pos="1440"/>
+                    </w:tabs>
+                    <w:jc w:val="center"/>
+                    <w:rPr>
+                      <w:rFonts w:ascii="Arial" w:eastAsia="Arial" w:hAnsi="Arial" w:cs="Arial"/>
+                      <w:bCs/>
+                      <w:sz w:val="18"/>
+                      <w:szCs w:val="18"/>
+                    </w:rPr>
+                  </w:pPr>
+                  <w:r>
+                    <w:rPr>
+                      <w:rFonts w:ascii="Arial" w:eastAsia="Arial" w:hAnsi="Arial" w:cs="Arial"/>
+                      <w:bCs/>
+                      <w:sz w:val="18"/>
+                      <w:szCs w:val="18"/>
+                    </w:rPr>
+                    <w:t>GUANTES DE SEGURIDAD</w:t>
+                  </w:r>
+                </w:p>
+              </w:tc>
+              <w:tc>
+                <w:tcPr>
+                  <w:tcW w:w="1984" w:type="dxa"/>
+                </w:tcPr>
+                <w:p>
+                  <w:pPr>
+                    <w:tabs>
+                      <w:tab w:val="left" w:pos="1440"/>
+                    </w:tabs>
+                    <w:jc w:val="center"/>
+                    <w:rPr>
+                      <w:rFonts w:ascii="Arial" w:eastAsia="Arial" w:hAnsi="Arial" w:cs="Arial"/>
+                      <w:bCs/>
+                      <w:sz w:val="18"/>
+                      <w:szCs w:val="18"/>
+                    </w:rPr>
+                  </w:pPr>
+                  <w:r>
+                    <w:rPr>
+                      <w:rFonts w:ascii="Arial" w:eastAsia="Arial" w:hAnsi="Arial" w:cs="Arial"/>
+                      <w:bCs/>
+                      <w:sz w:val="18"/>
+                      <w:szCs w:val="18"/>
+                    </w:rPr>
+                    <w:t>1</w:t>
+                  </w:r>
+                </w:p>
+              </w:tc>
+              <w:tc>
+                <w:tcPr>
+                  <w:tcW w:w="1985" w:type="dxa"/>
+                </w:tcPr>
+                <w:p>
+                  <w:pPr>
+                    <w:tabs>
+                      <w:tab w:val="left" w:pos="1440"/>
+                    </w:tabs>
+                    <w:jc w:val="center"/>
+                    <w:rPr>
+                      <w:rFonts w:ascii="Arial" w:eastAsia="Arial" w:hAnsi="Arial" w:cs="Arial"/>
+                      <w:bCs/>
+                      <w:sz w:val="18"/>
+                      <w:szCs w:val="18"/>
+                    </w:rPr>
+                  </w:pPr>
+                  <w:r>
+                    <w:rPr>
+                      <w:rFonts w:ascii="Arial" w:eastAsia="Arial" w:hAnsi="Arial" w:cs="Arial"/>
+                      <w:bCs/>
+                      <w:sz w:val="18"/>
+                      <w:szCs w:val="18"/>
+                    </w:rPr>
+                    <w:t>-</w:t>
+                  </w:r>
+                </w:p>
+              </w:tc>
+            </w:tr>
+            <w:tr>
+              <w:trPr>
+                <w:trHeight w:val="315"/>
+              </w:trPr>
+              <w:tc>
+                <w:tcPr>
+                  <w:tcW w:w="2689" w:type="dxa"/>
+                </w:tcPr>
+                <w:p>
+                  <w:pPr>
+                    <w:tabs>
+                      <w:tab w:val="left" w:pos="1440"/>
+                    </w:tabs>
+                    <w:jc w:val="center"/>
+                    <w:rPr>
+                      <w:rFonts w:ascii="Arial" w:eastAsia="Arial" w:hAnsi="Arial" w:cs="Arial"/>
+                      <w:bCs/>
+                      <w:sz w:val="18"/>
+                      <w:szCs w:val="18"/>
+                    </w:rPr>
+                  </w:pPr>
+                  <w:r>
+                    <w:rPr>
+                      <w:rFonts w:ascii="Arial" w:eastAsia="Arial" w:hAnsi="Arial" w:cs="Arial"/>
+                      <w:bCs/>
+                      <w:sz w:val="18"/>
+                      <w:szCs w:val="18"/>
+                    </w:rPr>
+                    <w:t>GAFAS DE PROTECCION</w:t>
+                  </w:r>
+                </w:p>
+              </w:tc>
+              <w:tc>
+                <w:tcPr>
+                  <w:tcW w:w="1984" w:type="dxa"/>
+                </w:tcPr>
+                <w:p>
+                  <w:pPr>
+                    <w:tabs>
+                      <w:tab w:val="left" w:pos="1440"/>
+                    </w:tabs>
+                    <w:jc w:val="center"/>
+                    <w:rPr>
+                      <w:rFonts w:ascii="Arial" w:eastAsia="Arial" w:hAnsi="Arial" w:cs="Arial"/>
+                      <w:bCs/>
+                      <w:sz w:val="18"/>
+                      <w:szCs w:val="18"/>
+                    </w:rPr>
+                  </w:pPr>
+                  <w:r>
+                    <w:rPr>
+                      <w:rFonts w:ascii="Arial" w:eastAsia="Arial" w:hAnsi="Arial" w:cs="Arial"/>
+                      <w:bCs/>
+                      <w:sz w:val="18"/>
+                      <w:szCs w:val="18"/>
+                    </w:rPr>
+                    <w:t>1</w:t>
+                  </w:r>
+                </w:p>
+              </w:tc>
+              <w:tc>
+                <w:tcPr>
+                  <w:tcW w:w="1985" w:type="dxa"/>
+                </w:tcPr>
+                <w:p>
+                  <w:pPr>
+                    <w:tabs>
+                      <w:tab w:val="left" w:pos="1440"/>
+                    </w:tabs>
+                    <w:jc w:val="center"/>
+                    <w:rPr>
+                      <w:rFonts w:ascii="Arial" w:eastAsia="Arial" w:hAnsi="Arial" w:cs="Arial"/>
+                      <w:bCs/>
+                      <w:sz w:val="18"/>
+                      <w:szCs w:val="18"/>
+                    </w:rPr>
+                  </w:pPr>
+                  <w:r>
+                    <w:rPr>
+                      <w:rFonts w:ascii="Arial" w:eastAsia="Arial" w:hAnsi="Arial" w:cs="Arial"/>
+                      <w:bCs/>
+                      <w:sz w:val="18"/>
+                      <w:szCs w:val="18"/>
+                    </w:rPr>
+                    <w:t>-</w:t>
                   </w:r>
                 </w:p>
               </w:tc>
@@ -514,27 +776,26 @@
                   </w:pPr>
                   <w:r>
                     <w:rPr>
-                      <w:rFonts w:ascii="Arial" w:eastAsia="Century" w:hAnsi="Arial" w:cs="Arial"/>
-                      <w:color w:val="000000"/>
+                      <w:rFonts w:ascii="Arial" w:hAnsi="Arial" w:cs="Arial"/>
                       <w:sz w:val="20"/>
                     </w:rPr>
                     <w:t>[</w:t>
                   </w:r>
-                  <w:r>
-                    <w:rPr>
-                      <w:rFonts w:ascii="Arial" w:eastAsia="Century" w:hAnsi="Arial" w:cs="Arial"/>
-                      <w:color w:val="000000"/>
+                  <w:proofErr w:type="gramStart"/>
+                  <w:r>
+                    <w:rPr>
+                      <w:rFonts w:ascii="Arial" w:hAnsi="Arial" w:cs="Arial"/>
                       <w:sz w:val="20"/>
                     </w:rPr>
                     <w:t>detalle.articulo</w:t>
                   </w:r>
-                  <w:r>
-                    <w:rPr>
-                      <w:rFonts w:ascii="Arial" w:eastAsia="Century" w:hAnsi="Arial" w:cs="Arial"/>
-                      <w:color w:val="000000"/>
-                      <w:sz w:val="20"/>
-                    </w:rPr>
-                    <w:t>_1]</w:t>
+                  <w:proofErr w:type="gramEnd"/>
+                  <w:r>
+                    <w:rPr>
+                      <w:rFonts w:ascii="Arial" w:hAnsi="Arial" w:cs="Arial"/>
+                      <w:sz w:val="20"/>
+                    </w:rPr>
+                    <w:t xml:space="preserve">_0] </w:t>
                   </w:r>
                 </w:p>
               </w:tc>
@@ -557,33 +818,21 @@
                     </w:rPr>
                     <w:t>[</w:t>
                   </w:r>
-                  <w:r>
-                    <w:rPr>
-                      <w:rFonts w:ascii="Arial" w:hAnsi="Arial" w:cs="Arial"/>
-                      <w:sz w:val="20"/>
-                    </w:rPr>
-                    <w:t>detalle</w:t>
-                  </w:r>
-                  <w:r>
-                    <w:rPr>
-                      <w:rFonts w:ascii="Arial" w:hAnsi="Arial" w:cs="Arial"/>
-                      <w:sz w:val="20"/>
-                    </w:rPr>
-                    <w:t>.</w:t>
-                  </w:r>
-                  <w:r>
-                    <w:rPr>
-                      <w:rFonts w:ascii="Arial" w:hAnsi="Arial" w:cs="Arial"/>
-                      <w:sz w:val="20"/>
-                    </w:rPr>
-                    <w:t>cantidad</w:t>
-                  </w:r>
-                  <w:r>
-                    <w:rPr>
-                      <w:rFonts w:ascii="Arial" w:hAnsi="Arial" w:cs="Arial"/>
-                      <w:sz w:val="20"/>
-                    </w:rPr>
-                    <w:t>_1]</w:t>
+                  <w:proofErr w:type="gramStart"/>
+                  <w:r>
+                    <w:rPr>
+                      <w:rFonts w:ascii="Arial" w:hAnsi="Arial" w:cs="Arial"/>
+                      <w:sz w:val="20"/>
+                    </w:rPr>
+                    <w:t>detalle.cantidad</w:t>
+                  </w:r>
+                  <w:proofErr w:type="gramEnd"/>
+                  <w:r>
+                    <w:rPr>
+                      <w:rFonts w:ascii="Arial" w:hAnsi="Arial" w:cs="Arial"/>
+                      <w:sz w:val="20"/>
+                    </w:rPr>
+                    <w:t xml:space="preserve">_0] </w:t>
                   </w:r>
                 </w:p>
               </w:tc>
@@ -604,7 +853,23 @@
                       <w:rFonts w:ascii="Arial" w:hAnsi="Arial" w:cs="Arial"/>
                       <w:sz w:val="20"/>
                     </w:rPr>
-                    <w:t>[detalle.talla_1]</w:t>
+                    <w:t>[</w:t>
+                  </w:r>
+                  <w:proofErr w:type="gramStart"/>
+                  <w:r>
+                    <w:rPr>
+                      <w:rFonts w:ascii="Arial" w:hAnsi="Arial" w:cs="Arial"/>
+                      <w:sz w:val="20"/>
+                    </w:rPr>
+                    <w:t>detalle.talla</w:t>
+                  </w:r>
+                  <w:proofErr w:type="gramEnd"/>
+                  <w:r>
+                    <w:rPr>
+                      <w:rFonts w:ascii="Arial" w:hAnsi="Arial" w:cs="Arial"/>
+                      <w:sz w:val="20"/>
+                    </w:rPr>
+                    <w:t>_0]</w:t>
                   </w:r>
                 </w:p>
               </w:tc>
@@ -633,6 +898,7 @@
                     </w:rPr>
                     <w:t>[</w:t>
                   </w:r>
+                  <w:proofErr w:type="gramStart"/>
                   <w:r>
                     <w:rPr>
                       <w:rFonts w:ascii="Arial" w:eastAsia="Century" w:hAnsi="Arial" w:cs="Arial"/>
@@ -641,29 +907,14 @@
                     </w:rPr>
                     <w:t>detalle.articulo</w:t>
                   </w:r>
+                  <w:proofErr w:type="gramEnd"/>
                   <w:r>
                     <w:rPr>
                       <w:rFonts w:ascii="Arial" w:eastAsia="Century" w:hAnsi="Arial" w:cs="Arial"/>
                       <w:color w:val="000000"/>
                       <w:sz w:val="20"/>
                     </w:rPr>
-                    <w:t>_</w:t>
-                  </w:r>
-                  <w:r>
-                    <w:rPr>
-                      <w:rFonts w:ascii="Arial" w:eastAsia="Century" w:hAnsi="Arial" w:cs="Arial"/>
-                      <w:color w:val="000000"/>
-                      <w:sz w:val="20"/>
-                    </w:rPr>
-                    <w:t>2</w:t>
-                  </w:r>
-                  <w:r>
-                    <w:rPr>
-                      <w:rFonts w:ascii="Arial" w:eastAsia="Century" w:hAnsi="Arial" w:cs="Arial"/>
-                      <w:color w:val="000000"/>
-                      <w:sz w:val="20"/>
-                    </w:rPr>
-                    <w:t>]</w:t>
+                    <w:t>_1]</w:t>
                   </w:r>
                 </w:p>
               </w:tc>
@@ -686,6 +937,7 @@
                     </w:rPr>
                     <w:t>[</w:t>
                   </w:r>
+                  <w:proofErr w:type="gramStart"/>
                   <w:r>
                     <w:rPr>
                       <w:rFonts w:ascii="Arial" w:hAnsi="Arial" w:cs="Arial"/>
@@ -707,26 +959,13 @@
                     </w:rPr>
                     <w:t>cantidad</w:t>
                   </w:r>
-                  <w:r>
-                    <w:rPr>
-                      <w:rFonts w:ascii="Arial" w:hAnsi="Arial" w:cs="Arial"/>
-                      <w:sz w:val="20"/>
-                    </w:rPr>
-                    <w:t>_</w:t>
-                  </w:r>
-                  <w:r>
-                    <w:rPr>
-                      <w:rFonts w:ascii="Arial" w:hAnsi="Arial" w:cs="Arial"/>
-                      <w:sz w:val="20"/>
-                    </w:rPr>
-                    <w:t>2</w:t>
-                  </w:r>
-                  <w:r>
-                    <w:rPr>
-                      <w:rFonts w:ascii="Arial" w:hAnsi="Arial" w:cs="Arial"/>
-                      <w:sz w:val="20"/>
-                    </w:rPr>
-                    <w:t>]</w:t>
+                  <w:proofErr w:type="gramEnd"/>
+                  <w:r>
+                    <w:rPr>
+                      <w:rFonts w:ascii="Arial" w:hAnsi="Arial" w:cs="Arial"/>
+                      <w:sz w:val="20"/>
+                    </w:rPr>
+                    <w:t>_1]</w:t>
                   </w:r>
                 </w:p>
               </w:tc>
@@ -747,7 +986,23 @@
                       <w:rFonts w:ascii="Arial" w:hAnsi="Arial" w:cs="Arial"/>
                       <w:sz w:val="20"/>
                     </w:rPr>
-                    <w:t>[detalle.talla_2]</w:t>
+                    <w:t>[</w:t>
+                  </w:r>
+                  <w:proofErr w:type="gramStart"/>
+                  <w:r>
+                    <w:rPr>
+                      <w:rFonts w:ascii="Arial" w:hAnsi="Arial" w:cs="Arial"/>
+                      <w:sz w:val="20"/>
+                    </w:rPr>
+                    <w:t>detalle.talla</w:t>
+                  </w:r>
+                  <w:proofErr w:type="gramEnd"/>
+                  <w:r>
+                    <w:rPr>
+                      <w:rFonts w:ascii="Arial" w:hAnsi="Arial" w:cs="Arial"/>
+                      <w:sz w:val="20"/>
+                    </w:rPr>
+                    <w:t>_1]</w:t>
                   </w:r>
                 </w:p>
               </w:tc>
@@ -776,6 +1031,7 @@
                     </w:rPr>
                     <w:t>[</w:t>
                   </w:r>
+                  <w:proofErr w:type="gramStart"/>
                   <w:r>
                     <w:rPr>
                       <w:rFonts w:ascii="Arial" w:eastAsia="Century" w:hAnsi="Arial" w:cs="Arial"/>
@@ -784,6 +1040,7 @@
                     </w:rPr>
                     <w:t>detalle.articulo</w:t>
                   </w:r>
+                  <w:proofErr w:type="gramEnd"/>
                   <w:r>
                     <w:rPr>
                       <w:rFonts w:ascii="Arial" w:eastAsia="Century" w:hAnsi="Arial" w:cs="Arial"/>
@@ -798,7 +1055,7 @@
                       <w:color w:val="000000"/>
                       <w:sz w:val="20"/>
                     </w:rPr>
-                    <w:t>3</w:t>
+                    <w:t>2</w:t>
                   </w:r>
                   <w:r>
                     <w:rPr>
@@ -829,6 +1086,7 @@
                     </w:rPr>
                     <w:t>[</w:t>
                   </w:r>
+                  <w:proofErr w:type="gramStart"/>
                   <w:r>
                     <w:rPr>
                       <w:rFonts w:ascii="Arial" w:hAnsi="Arial" w:cs="Arial"/>
@@ -850,6 +1108,7 @@
                     </w:rPr>
                     <w:t>cantidad</w:t>
                   </w:r>
+                  <w:proofErr w:type="gramEnd"/>
                   <w:r>
                     <w:rPr>
                       <w:rFonts w:ascii="Arial" w:hAnsi="Arial" w:cs="Arial"/>
@@ -862,7 +1121,7 @@
                       <w:rFonts w:ascii="Arial" w:hAnsi="Arial" w:cs="Arial"/>
                       <w:sz w:val="20"/>
                     </w:rPr>
-                    <w:t>3</w:t>
+                    <w:t>2</w:t>
                   </w:r>
                   <w:r>
                     <w:rPr>
@@ -885,6 +1144,29 @@
                       <w:sz w:val="20"/>
                     </w:rPr>
                   </w:pPr>
+                  <w:r>
+                    <w:rPr>
+                      <w:rFonts w:ascii="Arial" w:hAnsi="Arial" w:cs="Arial"/>
+                      <w:sz w:val="20"/>
+                    </w:rPr>
+                    <w:t>[</w:t>
+                  </w:r>
+                  <w:proofErr w:type="gramStart"/>
+                  <w:r>
+                    <w:rPr>
+                      <w:rFonts w:ascii="Arial" w:hAnsi="Arial" w:cs="Arial"/>
+                      <w:sz w:val="20"/>
+                    </w:rPr>
+                    <w:t>detalle.talla</w:t>
+                  </w:r>
+                  <w:proofErr w:type="gramEnd"/>
+                  <w:r>
+                    <w:rPr>
+                      <w:rFonts w:ascii="Arial" w:hAnsi="Arial" w:cs="Arial"/>
+                      <w:sz w:val="20"/>
+                    </w:rPr>
+                    <w:t>_2]</w:t>
+                  </w:r>
                 </w:p>
               </w:tc>
             </w:tr>
@@ -912,6 +1194,7 @@
                     </w:rPr>
                     <w:t>[</w:t>
                   </w:r>
+                  <w:proofErr w:type="gramStart"/>
                   <w:r>
                     <w:rPr>
                       <w:rFonts w:ascii="Arial" w:eastAsia="Century" w:hAnsi="Arial" w:cs="Arial"/>
@@ -920,6 +1203,7 @@
                     </w:rPr>
                     <w:t>detalle.articulo</w:t>
                   </w:r>
+                  <w:proofErr w:type="gramEnd"/>
                   <w:r>
                     <w:rPr>
                       <w:rFonts w:ascii="Arial" w:eastAsia="Century" w:hAnsi="Arial" w:cs="Arial"/>
@@ -934,7 +1218,7 @@
                       <w:color w:val="000000"/>
                       <w:sz w:val="20"/>
                     </w:rPr>
-                    <w:t>4</w:t>
+                    <w:t>3</w:t>
                   </w:r>
                   <w:r>
                     <w:rPr>
@@ -965,6 +1249,7 @@
                     </w:rPr>
                     <w:t>[</w:t>
                   </w:r>
+                  <w:proofErr w:type="gramStart"/>
                   <w:r>
                     <w:rPr>
                       <w:rFonts w:ascii="Arial" w:hAnsi="Arial" w:cs="Arial"/>
@@ -986,6 +1271,7 @@
                     </w:rPr>
                     <w:t>cantidad</w:t>
                   </w:r>
+                  <w:proofErr w:type="gramEnd"/>
                   <w:r>
                     <w:rPr>
                       <w:rFonts w:ascii="Arial" w:hAnsi="Arial" w:cs="Arial"/>
@@ -998,7 +1284,7 @@
                       <w:rFonts w:ascii="Arial" w:hAnsi="Arial" w:cs="Arial"/>
                       <w:sz w:val="20"/>
                     </w:rPr>
-                    <w:t>4</w:t>
+                    <w:t>3</w:t>
                   </w:r>
                   <w:r>
                     <w:rPr>
@@ -1021,6 +1307,43 @@
                       <w:sz w:val="20"/>
                     </w:rPr>
                   </w:pPr>
+                  <w:r>
+                    <w:rPr>
+                      <w:rFonts w:ascii="Arial" w:hAnsi="Arial" w:cs="Arial"/>
+                      <w:sz w:val="20"/>
+                    </w:rPr>
+                    <w:t>[</w:t>
+                  </w:r>
+                  <w:proofErr w:type="gramStart"/>
+                  <w:r>
+                    <w:rPr>
+                      <w:rFonts w:ascii="Arial" w:hAnsi="Arial" w:cs="Arial"/>
+                      <w:sz w:val="20"/>
+                    </w:rPr>
+                    <w:t>detalle.talla</w:t>
+                  </w:r>
+                  <w:proofErr w:type="gramEnd"/>
+                  <w:r>
+                    <w:rPr>
+                      <w:rFonts w:ascii="Arial" w:hAnsi="Arial" w:cs="Arial"/>
+                      <w:sz w:val="20"/>
+                    </w:rPr>
+                    <w:t>_</w:t>
+                  </w:r>
+                  <w:r>
+                    <w:rPr>
+                      <w:rFonts w:ascii="Arial" w:hAnsi="Arial" w:cs="Arial"/>
+                      <w:sz w:val="20"/>
+                    </w:rPr>
+                    <w:t>3</w:t>
+                  </w:r>
+                  <w:r>
+                    <w:rPr>
+                      <w:rFonts w:ascii="Arial" w:hAnsi="Arial" w:cs="Arial"/>
+                      <w:sz w:val="20"/>
+                    </w:rPr>
+                    <w:t>]</w:t>
+                  </w:r>
                 </w:p>
               </w:tc>
             </w:tr>
@@ -1048,6 +1371,7 @@
                     </w:rPr>
                     <w:t>[</w:t>
                   </w:r>
+                  <w:proofErr w:type="gramStart"/>
                   <w:r>
                     <w:rPr>
                       <w:rFonts w:ascii="Arial" w:eastAsia="Century" w:hAnsi="Arial" w:cs="Arial"/>
@@ -1056,6 +1380,7 @@
                     </w:rPr>
                     <w:t>detalle.articulo</w:t>
                   </w:r>
+                  <w:proofErr w:type="gramEnd"/>
                   <w:r>
                     <w:rPr>
                       <w:rFonts w:ascii="Arial" w:eastAsia="Century" w:hAnsi="Arial" w:cs="Arial"/>
@@ -1070,7 +1395,7 @@
                       <w:color w:val="000000"/>
                       <w:sz w:val="20"/>
                     </w:rPr>
-                    <w:t>5</w:t>
+                    <w:t>4</w:t>
                   </w:r>
                   <w:r>
                     <w:rPr>
@@ -1101,6 +1426,7 @@
                     </w:rPr>
                     <w:t>[</w:t>
                   </w:r>
+                  <w:proofErr w:type="gramStart"/>
                   <w:r>
                     <w:rPr>
                       <w:rFonts w:ascii="Arial" w:hAnsi="Arial" w:cs="Arial"/>
@@ -1122,6 +1448,198 @@
                     </w:rPr>
                     <w:t>cantidad</w:t>
                   </w:r>
+                  <w:proofErr w:type="gramEnd"/>
+                  <w:r>
+                    <w:rPr>
+                      <w:rFonts w:ascii="Arial" w:hAnsi="Arial" w:cs="Arial"/>
+                      <w:sz w:val="20"/>
+                    </w:rPr>
+                    <w:t>_</w:t>
+                  </w:r>
+                  <w:r>
+                    <w:rPr>
+                      <w:rFonts w:ascii="Arial" w:hAnsi="Arial" w:cs="Arial"/>
+                      <w:sz w:val="20"/>
+                    </w:rPr>
+                    <w:t>4</w:t>
+                  </w:r>
+                  <w:r>
+                    <w:rPr>
+                      <w:rFonts w:ascii="Arial" w:hAnsi="Arial" w:cs="Arial"/>
+                      <w:sz w:val="20"/>
+                    </w:rPr>
+                    <w:t>]</w:t>
+                  </w:r>
+                </w:p>
+              </w:tc>
+              <w:tc>
+                <w:tcPr>
+                  <w:tcW w:w="1985" w:type="dxa"/>
+                </w:tcPr>
+                <w:p>
+                  <w:pPr>
+                    <w:jc w:val="center"/>
+                    <w:rPr>
+                      <w:rFonts w:ascii="Arial" w:hAnsi="Arial" w:cs="Arial"/>
+                      <w:sz w:val="20"/>
+                    </w:rPr>
+                  </w:pPr>
+                  <w:r>
+                    <w:rPr>
+                      <w:rFonts w:ascii="Arial" w:hAnsi="Arial" w:cs="Arial"/>
+                      <w:sz w:val="20"/>
+                    </w:rPr>
+                    <w:t>[</w:t>
+                  </w:r>
+                  <w:proofErr w:type="gramStart"/>
+                  <w:r>
+                    <w:rPr>
+                      <w:rFonts w:ascii="Arial" w:hAnsi="Arial" w:cs="Arial"/>
+                      <w:sz w:val="20"/>
+                    </w:rPr>
+                    <w:t>detalle</w:t>
+                  </w:r>
+                  <w:r>
+                    <w:rPr>
+                      <w:rFonts w:ascii="Arial" w:hAnsi="Arial" w:cs="Arial"/>
+                      <w:sz w:val="20"/>
+                    </w:rPr>
+                    <w:t>.</w:t>
+                  </w:r>
+                  <w:r>
+                    <w:rPr>
+                      <w:rFonts w:ascii="Arial" w:hAnsi="Arial" w:cs="Arial"/>
+                      <w:sz w:val="20"/>
+                    </w:rPr>
+                    <w:t>cantidad</w:t>
+                  </w:r>
+                  <w:proofErr w:type="gramEnd"/>
+                  <w:r>
+                    <w:rPr>
+                      <w:rFonts w:ascii="Arial" w:hAnsi="Arial" w:cs="Arial"/>
+                      <w:sz w:val="20"/>
+                    </w:rPr>
+                    <w:t>_</w:t>
+                  </w:r>
+                  <w:r>
+                    <w:rPr>
+                      <w:rFonts w:ascii="Arial" w:hAnsi="Arial" w:cs="Arial"/>
+                      <w:sz w:val="20"/>
+                    </w:rPr>
+                    <w:t>4</w:t>
+                  </w:r>
+                  <w:r>
+                    <w:rPr>
+                      <w:rFonts w:ascii="Arial" w:hAnsi="Arial" w:cs="Arial"/>
+                      <w:sz w:val="20"/>
+                    </w:rPr>
+                    <w:t>]</w:t>
+                  </w:r>
+                </w:p>
+              </w:tc>
+            </w:tr>
+            <w:tr>
+              <w:trPr>
+                <w:trHeight w:val="360"/>
+              </w:trPr>
+              <w:tc>
+                <w:tcPr>
+                  <w:tcW w:w="2689" w:type="dxa"/>
+                </w:tcPr>
+                <w:p>
+                  <w:pPr>
+                    <w:rPr>
+                      <w:rFonts w:ascii="Arial" w:eastAsia="Century" w:hAnsi="Arial" w:cs="Arial"/>
+                      <w:color w:val="000000"/>
+                      <w:sz w:val="20"/>
+                    </w:rPr>
+                  </w:pPr>
+                  <w:r>
+                    <w:rPr>
+                      <w:rFonts w:ascii="Arial" w:eastAsia="Century" w:hAnsi="Arial" w:cs="Arial"/>
+                      <w:color w:val="000000"/>
+                      <w:sz w:val="20"/>
+                    </w:rPr>
+                    <w:t>[</w:t>
+                  </w:r>
+                  <w:proofErr w:type="gramStart"/>
+                  <w:r>
+                    <w:rPr>
+                      <w:rFonts w:ascii="Arial" w:eastAsia="Century" w:hAnsi="Arial" w:cs="Arial"/>
+                      <w:color w:val="000000"/>
+                      <w:sz w:val="20"/>
+                    </w:rPr>
+                    <w:t>detalle.articulo</w:t>
+                  </w:r>
+                  <w:proofErr w:type="gramEnd"/>
+                  <w:r>
+                    <w:rPr>
+                      <w:rFonts w:ascii="Arial" w:eastAsia="Century" w:hAnsi="Arial" w:cs="Arial"/>
+                      <w:color w:val="000000"/>
+                      <w:sz w:val="20"/>
+                    </w:rPr>
+                    <w:t>_</w:t>
+                  </w:r>
+                  <w:r>
+                    <w:rPr>
+                      <w:rFonts w:ascii="Arial" w:eastAsia="Century" w:hAnsi="Arial" w:cs="Arial"/>
+                      <w:color w:val="000000"/>
+                      <w:sz w:val="20"/>
+                    </w:rPr>
+                    <w:t>5</w:t>
+                  </w:r>
+                  <w:r>
+                    <w:rPr>
+                      <w:rFonts w:ascii="Arial" w:eastAsia="Century" w:hAnsi="Arial" w:cs="Arial"/>
+                      <w:color w:val="000000"/>
+                      <w:sz w:val="20"/>
+                    </w:rPr>
+                    <w:t>]</w:t>
+                  </w:r>
+                </w:p>
+              </w:tc>
+              <w:tc>
+                <w:tcPr>
+                  <w:tcW w:w="1984" w:type="dxa"/>
+                </w:tcPr>
+                <w:p>
+                  <w:pPr>
+                    <w:jc w:val="center"/>
+                    <w:rPr>
+                      <w:rFonts w:ascii="Arial" w:hAnsi="Arial" w:cs="Arial"/>
+                      <w:sz w:val="20"/>
+                    </w:rPr>
+                  </w:pPr>
+                  <w:r>
+                    <w:rPr>
+                      <w:rFonts w:ascii="Arial" w:hAnsi="Arial" w:cs="Arial"/>
+                      <w:sz w:val="20"/>
+                    </w:rPr>
+                    <w:t>[</w:t>
+                  </w:r>
+                  <w:proofErr w:type="gramStart"/>
+                  <w:r>
+                    <w:rPr>
+                      <w:rFonts w:ascii="Arial" w:hAnsi="Arial" w:cs="Arial"/>
+                      <w:sz w:val="20"/>
+                    </w:rPr>
+                    <w:t>detalle</w:t>
+                  </w:r>
+                  <w:r>
+                    <w:rPr>
+                      <w:rFonts w:ascii="Arial" w:hAnsi="Arial" w:cs="Arial"/>
+                      <w:sz w:val="20"/>
+                    </w:rPr>
+                    <w:t>.</w:t>
+                  </w:r>
+                  <w:r>
+                    <w:rPr>
+                      <w:rFonts w:ascii="Arial" w:hAnsi="Arial" w:cs="Arial"/>
+                      <w:sz w:val="20"/>
+                    </w:rPr>
+                    <w:t>cantidad</w:t>
+                  </w:r>
+                  <w:proofErr w:type="gramEnd"/>
                   <w:r>
                     <w:rPr>
                       <w:rFonts w:ascii="Arial" w:hAnsi="Arial" w:cs="Arial"/>
@@ -1275,6 +1793,36 @@
                 <w:bCs/>
                 <w:sz w:val="24"/>
                 <w:szCs w:val="24"/>
+              </w:rPr>
+            </w:pPr>
+          </w:p>
+          <w:p>
+            <w:pPr>
+              <w:jc w:val="both"/>
+              <w:rPr>
+                <w:rFonts w:ascii="Arial" w:hAnsi="Arial" w:cs="Arial"/>
+                <w:b/>
+                <w:bCs/>
+              </w:rPr>
+            </w:pPr>
+          </w:p>
+          <w:p>
+            <w:pPr>
+              <w:jc w:val="both"/>
+              <w:rPr>
+                <w:rFonts w:ascii="Arial" w:hAnsi="Arial" w:cs="Arial"/>
+                <w:b/>
+                <w:bCs/>
+              </w:rPr>
+            </w:pPr>
+          </w:p>
+          <w:p>
+            <w:pPr>
+              <w:jc w:val="both"/>
+              <w:rPr>
+                <w:rFonts w:ascii="Arial" w:hAnsi="Arial" w:cs="Arial"/>
+                <w:b/>
+                <w:bCs/>
               </w:rPr>
             </w:pPr>
           </w:p>
@@ -1437,6 +1985,7 @@
                       <w:lang w:val="es-419"/>
                     </w:rPr>
                   </w:pPr>
+                  <w:proofErr w:type="gramStart"/>
                   <w:r>
                     <w:rPr>
                       <w:rFonts w:ascii="Arial" w:eastAsia="Arial" w:hAnsi="Arial" w:cs="Arial"/>
@@ -1458,6 +2007,7 @@
                     <w:t>[</w:t>
                   </w:r>
                   <w:proofErr w:type="spellStart"/>
+                  <w:proofErr w:type="gramEnd"/>
                   <w:r>
                     <w:rPr>
                       <w:rFonts w:ascii="Arial" w:hAnsi="Arial" w:cs="Arial"/>
@@ -1483,6 +2033,7 @@
                       <w:rFonts w:ascii="Arial" w:eastAsia="Arial" w:hAnsi="Arial" w:cs="Arial"/>
                     </w:rPr>
                   </w:pPr>
+                  <w:proofErr w:type="gramStart"/>
                   <w:r>
                     <w:rPr>
                       <w:rFonts w:ascii="Arial" w:eastAsia="Arial" w:hAnsi="Arial" w:cs="Arial"/>
@@ -1504,6 +2055,7 @@
                     <w:t>[</w:t>
                   </w:r>
                   <w:proofErr w:type="spellStart"/>
+                  <w:proofErr w:type="gramEnd"/>
                   <w:r>
                     <w:rPr>
                       <w:rFonts w:ascii="Arial" w:hAnsi="Arial" w:cs="Arial"/>
@@ -1627,7 +2179,6 @@
         <w:tabs>
           <w:tab w:val="left" w:pos="1440"/>
         </w:tabs>
-        <w:jc w:val="center"/>
         <w:rPr>
           <w:rFonts w:ascii="Arial" w:eastAsia="Arial" w:hAnsi="Arial" w:cs="Arial"/>
           <w:b/>
@@ -1688,7 +2239,7 @@
       <w:headerReference w:type="default" r:id="rId6"/>
       <w:footerReference w:type="default" r:id="rId7"/>
       <w:pgSz w:w="11907" w:h="16839"/>
-      <w:pgMar w:top="1417" w:right="1701" w:bottom="1417" w:left="1701" w:header="708" w:footer="708" w:gutter="0"/>
+      <w:pgMar w:top="1417" w:right="1701" w:bottom="284" w:left="1701" w:header="708" w:footer="708" w:gutter="0"/>
       <w:pgNumType w:start="1"/>
       <w:cols w:space="720"/>
     </w:sectPr>
@@ -1982,7 +2533,7 @@
           <wp:extent cx="276225" cy="257175"/>
           <wp:effectExtent l="0" t="0" r="0" b="0"/>
           <wp:wrapNone/>
-          <wp:docPr id="7" name="image1.png"/>
+          <wp:docPr id="35" name="image1.png"/>
           <wp:cNvGraphicFramePr/>
           <a:graphic xmlns:a="http://schemas.openxmlformats.org/drawingml/2006/main">
             <a:graphicData uri="http://schemas.openxmlformats.org/drawingml/2006/picture">
@@ -2152,7 +2703,7 @@
           <wp:extent cx="2343150" cy="368300"/>
           <wp:effectExtent l="0" t="0" r="0" b="0"/>
           <wp:wrapNone/>
-          <wp:docPr id="8" name="image8.png" descr="D:\LOGOS GRUPO BM\HAGGERSTON.png"/>
+          <wp:docPr id="36" name="image8.png" descr="D:\LOGOS GRUPO BM\HAGGERSTON.png"/>
           <wp:cNvGraphicFramePr/>
           <a:graphic xmlns:a="http://schemas.openxmlformats.org/drawingml/2006/main">
             <a:graphicData uri="http://schemas.openxmlformats.org/drawingml/2006/picture">
@@ -2298,7 +2849,7 @@
           <wp:extent cx="228600" cy="247650"/>
           <wp:effectExtent l="0" t="0" r="0" b="0"/>
           <wp:wrapNone/>
-          <wp:docPr id="5" name="image4.png"/>
+          <wp:docPr id="37" name="image4.png"/>
           <wp:cNvGraphicFramePr/>
           <a:graphic xmlns:a="http://schemas.openxmlformats.org/drawingml/2006/main">
             <a:graphicData uri="http://schemas.openxmlformats.org/drawingml/2006/picture">
@@ -2346,7 +2897,7 @@
           <wp:extent cx="247650" cy="247650"/>
           <wp:effectExtent l="0" t="0" r="0" b="0"/>
           <wp:wrapNone/>
-          <wp:docPr id="6" name="image5.png"/>
+          <wp:docPr id="38" name="image5.png"/>
           <wp:cNvGraphicFramePr/>
           <a:graphic xmlns:a="http://schemas.openxmlformats.org/drawingml/2006/main">
             <a:graphicData uri="http://schemas.openxmlformats.org/drawingml/2006/picture">

</xml_diff>